<commit_message>
Update submission docs sizing and add HLD sources (issue #75)
</commit_message>
<xml_diff>
--- a/docs/final semester a submission/StageA_Submission.docx
+++ b/docs/final semester a submission/StageA_Submission.docx
@@ -849,7 +849,7 @@
       <w:r>
         <w:drawing>
           <wp:inline xmlns:a="http://schemas.openxmlformats.org/drawingml/2006/main" xmlns:pic="http://schemas.openxmlformats.org/drawingml/2006/picture">
-            <wp:extent cx="5486400" cy="3535885"/>
+            <wp:extent cx="4800600" cy="3093900"/>
             <wp:docPr id="1" name="Picture 1"/>
             <wp:cNvGraphicFramePr>
               <a:graphicFrameLocks noChangeAspect="1"/>
@@ -870,7 +870,7 @@
                   <pic:spPr>
                     <a:xfrm>
                       <a:off x="0" y="0"/>
-                      <a:ext cx="5486400" cy="3535885"/>
+                      <a:ext cx="4800600" cy="3093900"/>
                     </a:xfrm>
                     <a:prstGeom prst="rect"/>
                   </pic:spPr>
@@ -1524,7 +1524,7 @@
       <w:r>
         <w:drawing>
           <wp:inline xmlns:a="http://schemas.openxmlformats.org/drawingml/2006/main" xmlns:pic="http://schemas.openxmlformats.org/drawingml/2006/picture">
-            <wp:extent cx="5486400" cy="18392078"/>
+            <wp:extent cx="4800600" cy="16093068"/>
             <wp:docPr id="2" name="Picture 2"/>
             <wp:cNvGraphicFramePr>
               <a:graphicFrameLocks noChangeAspect="1"/>
@@ -1545,7 +1545,7 @@
                   <pic:spPr>
                     <a:xfrm>
                       <a:off x="0" y="0"/>
-                      <a:ext cx="5486400" cy="18392078"/>
+                      <a:ext cx="4800600" cy="16093068"/>
                     </a:xfrm>
                     <a:prstGeom prst="rect"/>
                   </pic:spPr>
@@ -1568,7 +1568,7 @@
       <w:r>
         <w:drawing>
           <wp:inline xmlns:a="http://schemas.openxmlformats.org/drawingml/2006/main" xmlns:pic="http://schemas.openxmlformats.org/drawingml/2006/picture">
-            <wp:extent cx="5486400" cy="3535885"/>
+            <wp:extent cx="4800600" cy="3093900"/>
             <wp:docPr id="3" name="Picture 3"/>
             <wp:cNvGraphicFramePr>
               <a:graphicFrameLocks noChangeAspect="1"/>
@@ -1589,7 +1589,7 @@
                   <pic:spPr>
                     <a:xfrm>
                       <a:off x="0" y="0"/>
-                      <a:ext cx="5486400" cy="3535885"/>
+                      <a:ext cx="4800600" cy="3093900"/>
                     </a:xfrm>
                     <a:prstGeom prst="rect"/>
                   </pic:spPr>
@@ -1612,7 +1612,7 @@
       <w:r>
         <w:drawing>
           <wp:inline xmlns:a="http://schemas.openxmlformats.org/drawingml/2006/main" xmlns:pic="http://schemas.openxmlformats.org/drawingml/2006/picture">
-            <wp:extent cx="5486400" cy="5014966"/>
+            <wp:extent cx="4800600" cy="4388095"/>
             <wp:docPr id="4" name="Picture 4"/>
             <wp:cNvGraphicFramePr>
               <a:graphicFrameLocks noChangeAspect="1"/>
@@ -1633,7 +1633,7 @@
                   <pic:spPr>
                     <a:xfrm>
                       <a:off x="0" y="0"/>
-                      <a:ext cx="5486400" cy="5014966"/>
+                      <a:ext cx="4800600" cy="4388095"/>
                     </a:xfrm>
                     <a:prstGeom prst="rect"/>
                   </pic:spPr>
@@ -1656,7 +1656,7 @@
       <w:r>
         <w:drawing>
           <wp:inline xmlns:a="http://schemas.openxmlformats.org/drawingml/2006/main" xmlns:pic="http://schemas.openxmlformats.org/drawingml/2006/picture">
-            <wp:extent cx="5486400" cy="6980971"/>
+            <wp:extent cx="4800600" cy="6108350"/>
             <wp:docPr id="5" name="Picture 5"/>
             <wp:cNvGraphicFramePr>
               <a:graphicFrameLocks noChangeAspect="1"/>
@@ -1677,7 +1677,7 @@
                   <pic:spPr>
                     <a:xfrm>
                       <a:off x="0" y="0"/>
-                      <a:ext cx="5486400" cy="6980971"/>
+                      <a:ext cx="4800600" cy="6108350"/>
                     </a:xfrm>
                     <a:prstGeom prst="rect"/>
                   </pic:spPr>

</xml_diff>

<commit_message>
Resize UML images to fit A4 pages (issue #75)
</commit_message>
<xml_diff>
--- a/docs/final semester a submission/StageA_Submission.docx
+++ b/docs/final semester a submission/StageA_Submission.docx
@@ -40,15 +40,15 @@
         <w:tblLook w:firstColumn="1" w:firstRow="1" w:lastColumn="0" w:lastRow="0" w:noHBand="0" w:noVBand="1" w:val="04A0"/>
       </w:tblPr>
       <w:tblGrid>
-        <w:gridCol w:w="2160"/>
-        <w:gridCol w:w="2160"/>
-        <w:gridCol w:w="2160"/>
-        <w:gridCol w:w="2160"/>
+        <w:gridCol w:w="2256"/>
+        <w:gridCol w:w="2256"/>
+        <w:gridCol w:w="2256"/>
+        <w:gridCol w:w="2256"/>
       </w:tblGrid>
       <w:tr>
         <w:tc>
           <w:tcPr>
-            <w:tcW w:type="dxa" w:w="2160"/>
+            <w:tcW w:type="dxa" w:w="2256"/>
           </w:tcPr>
           <w:p>
             <w:r>
@@ -58,7 +58,7 @@
         </w:tc>
         <w:tc>
           <w:tcPr>
-            <w:tcW w:type="dxa" w:w="2160"/>
+            <w:tcW w:type="dxa" w:w="2256"/>
           </w:tcPr>
           <w:p>
             <w:r>
@@ -68,7 +68,7 @@
         </w:tc>
         <w:tc>
           <w:tcPr>
-            <w:tcW w:type="dxa" w:w="2160"/>
+            <w:tcW w:type="dxa" w:w="2256"/>
           </w:tcPr>
           <w:p>
             <w:r>
@@ -78,7 +78,7 @@
         </w:tc>
         <w:tc>
           <w:tcPr>
-            <w:tcW w:type="dxa" w:w="2160"/>
+            <w:tcW w:type="dxa" w:w="2256"/>
           </w:tcPr>
           <w:p>
             <w:r>
@@ -90,7 +90,7 @@
       <w:tr>
         <w:tc>
           <w:tcPr>
-            <w:tcW w:type="dxa" w:w="2160"/>
+            <w:tcW w:type="dxa" w:w="2256"/>
           </w:tcPr>
           <w:p>
             <w:r>
@@ -100,7 +100,7 @@
         </w:tc>
         <w:tc>
           <w:tcPr>
-            <w:tcW w:type="dxa" w:w="2160"/>
+            <w:tcW w:type="dxa" w:w="2256"/>
           </w:tcPr>
           <w:p>
             <w:r>
@@ -110,7 +110,7 @@
         </w:tc>
         <w:tc>
           <w:tcPr>
-            <w:tcW w:type="dxa" w:w="2160"/>
+            <w:tcW w:type="dxa" w:w="2256"/>
           </w:tcPr>
           <w:p>
             <w:r>
@@ -120,7 +120,7 @@
         </w:tc>
         <w:tc>
           <w:tcPr>
-            <w:tcW w:type="dxa" w:w="2160"/>
+            <w:tcW w:type="dxa" w:w="2256"/>
           </w:tcPr>
           <w:p>
             <w:r>
@@ -132,7 +132,7 @@
       <w:tr>
         <w:tc>
           <w:tcPr>
-            <w:tcW w:type="dxa" w:w="2160"/>
+            <w:tcW w:type="dxa" w:w="2256"/>
           </w:tcPr>
           <w:p>
             <w:r>
@@ -142,7 +142,7 @@
         </w:tc>
         <w:tc>
           <w:tcPr>
-            <w:tcW w:type="dxa" w:w="2160"/>
+            <w:tcW w:type="dxa" w:w="2256"/>
           </w:tcPr>
           <w:p>
             <w:r>
@@ -152,7 +152,7 @@
         </w:tc>
         <w:tc>
           <w:tcPr>
-            <w:tcW w:type="dxa" w:w="2160"/>
+            <w:tcW w:type="dxa" w:w="2256"/>
           </w:tcPr>
           <w:p>
             <w:r>
@@ -162,7 +162,7 @@
         </w:tc>
         <w:tc>
           <w:tcPr>
-            <w:tcW w:type="dxa" w:w="2160"/>
+            <w:tcW w:type="dxa" w:w="2256"/>
           </w:tcPr>
           <w:p>
             <w:r>
@@ -174,7 +174,7 @@
       <w:tr>
         <w:tc>
           <w:tcPr>
-            <w:tcW w:type="dxa" w:w="2160"/>
+            <w:tcW w:type="dxa" w:w="2256"/>
           </w:tcPr>
           <w:p>
             <w:r>
@@ -184,7 +184,7 @@
         </w:tc>
         <w:tc>
           <w:tcPr>
-            <w:tcW w:type="dxa" w:w="2160"/>
+            <w:tcW w:type="dxa" w:w="2256"/>
           </w:tcPr>
           <w:p>
             <w:r>
@@ -194,7 +194,7 @@
         </w:tc>
         <w:tc>
           <w:tcPr>
-            <w:tcW w:type="dxa" w:w="2160"/>
+            <w:tcW w:type="dxa" w:w="2256"/>
           </w:tcPr>
           <w:p>
             <w:r>
@@ -204,7 +204,7 @@
         </w:tc>
         <w:tc>
           <w:tcPr>
-            <w:tcW w:type="dxa" w:w="2160"/>
+            <w:tcW w:type="dxa" w:w="2256"/>
           </w:tcPr>
           <w:p>
             <w:r>
@@ -216,7 +216,7 @@
       <w:tr>
         <w:tc>
           <w:tcPr>
-            <w:tcW w:type="dxa" w:w="2160"/>
+            <w:tcW w:type="dxa" w:w="2256"/>
           </w:tcPr>
           <w:p>
             <w:r>
@@ -226,7 +226,7 @@
         </w:tc>
         <w:tc>
           <w:tcPr>
-            <w:tcW w:type="dxa" w:w="2160"/>
+            <w:tcW w:type="dxa" w:w="2256"/>
           </w:tcPr>
           <w:p>
             <w:r>
@@ -236,7 +236,7 @@
         </w:tc>
         <w:tc>
           <w:tcPr>
-            <w:tcW w:type="dxa" w:w="2160"/>
+            <w:tcW w:type="dxa" w:w="2256"/>
           </w:tcPr>
           <w:p>
             <w:r>
@@ -246,7 +246,7 @@
         </w:tc>
         <w:tc>
           <w:tcPr>
-            <w:tcW w:type="dxa" w:w="2160"/>
+            <w:tcW w:type="dxa" w:w="2256"/>
           </w:tcPr>
           <w:p>
             <w:r>
@@ -258,7 +258,7 @@
       <w:tr>
         <w:tc>
           <w:tcPr>
-            <w:tcW w:type="dxa" w:w="2160"/>
+            <w:tcW w:type="dxa" w:w="2256"/>
           </w:tcPr>
           <w:p>
             <w:r>
@@ -268,7 +268,7 @@
         </w:tc>
         <w:tc>
           <w:tcPr>
-            <w:tcW w:type="dxa" w:w="2160"/>
+            <w:tcW w:type="dxa" w:w="2256"/>
           </w:tcPr>
           <w:p>
             <w:r>
@@ -278,7 +278,7 @@
         </w:tc>
         <w:tc>
           <w:tcPr>
-            <w:tcW w:type="dxa" w:w="2160"/>
+            <w:tcW w:type="dxa" w:w="2256"/>
           </w:tcPr>
           <w:p>
             <w:r>
@@ -288,7 +288,7 @@
         </w:tc>
         <w:tc>
           <w:tcPr>
-            <w:tcW w:type="dxa" w:w="2160"/>
+            <w:tcW w:type="dxa" w:w="2256"/>
           </w:tcPr>
           <w:p>
             <w:r>
@@ -300,7 +300,7 @@
       <w:tr>
         <w:tc>
           <w:tcPr>
-            <w:tcW w:type="dxa" w:w="2160"/>
+            <w:tcW w:type="dxa" w:w="2256"/>
           </w:tcPr>
           <w:p>
             <w:r>
@@ -310,7 +310,7 @@
         </w:tc>
         <w:tc>
           <w:tcPr>
-            <w:tcW w:type="dxa" w:w="2160"/>
+            <w:tcW w:type="dxa" w:w="2256"/>
           </w:tcPr>
           <w:p>
             <w:r>
@@ -320,7 +320,7 @@
         </w:tc>
         <w:tc>
           <w:tcPr>
-            <w:tcW w:type="dxa" w:w="2160"/>
+            <w:tcW w:type="dxa" w:w="2256"/>
           </w:tcPr>
           <w:p>
             <w:r>
@@ -330,7 +330,7 @@
         </w:tc>
         <w:tc>
           <w:tcPr>
-            <w:tcW w:type="dxa" w:w="2160"/>
+            <w:tcW w:type="dxa" w:w="2256"/>
           </w:tcPr>
           <w:p>
             <w:r>
@@ -342,7 +342,7 @@
       <w:tr>
         <w:tc>
           <w:tcPr>
-            <w:tcW w:type="dxa" w:w="2160"/>
+            <w:tcW w:type="dxa" w:w="2256"/>
           </w:tcPr>
           <w:p>
             <w:r>
@@ -352,7 +352,7 @@
         </w:tc>
         <w:tc>
           <w:tcPr>
-            <w:tcW w:type="dxa" w:w="2160"/>
+            <w:tcW w:type="dxa" w:w="2256"/>
           </w:tcPr>
           <w:p>
             <w:r>
@@ -362,7 +362,7 @@
         </w:tc>
         <w:tc>
           <w:tcPr>
-            <w:tcW w:type="dxa" w:w="2160"/>
+            <w:tcW w:type="dxa" w:w="2256"/>
           </w:tcPr>
           <w:p>
             <w:r>
@@ -372,7 +372,7 @@
         </w:tc>
         <w:tc>
           <w:tcPr>
-            <w:tcW w:type="dxa" w:w="2160"/>
+            <w:tcW w:type="dxa" w:w="2256"/>
           </w:tcPr>
           <w:p>
             <w:r>
@@ -384,7 +384,7 @@
       <w:tr>
         <w:tc>
           <w:tcPr>
-            <w:tcW w:type="dxa" w:w="2160"/>
+            <w:tcW w:type="dxa" w:w="2256"/>
           </w:tcPr>
           <w:p>
             <w:r>
@@ -394,7 +394,7 @@
         </w:tc>
         <w:tc>
           <w:tcPr>
-            <w:tcW w:type="dxa" w:w="2160"/>
+            <w:tcW w:type="dxa" w:w="2256"/>
           </w:tcPr>
           <w:p>
             <w:r>
@@ -404,7 +404,7 @@
         </w:tc>
         <w:tc>
           <w:tcPr>
-            <w:tcW w:type="dxa" w:w="2160"/>
+            <w:tcW w:type="dxa" w:w="2256"/>
           </w:tcPr>
           <w:p>
             <w:r>
@@ -414,7 +414,7 @@
         </w:tc>
         <w:tc>
           <w:tcPr>
-            <w:tcW w:type="dxa" w:w="2160"/>
+            <w:tcW w:type="dxa" w:w="2256"/>
           </w:tcPr>
           <w:p>
             <w:r>
@@ -426,7 +426,7 @@
       <w:tr>
         <w:tc>
           <w:tcPr>
-            <w:tcW w:type="dxa" w:w="2160"/>
+            <w:tcW w:type="dxa" w:w="2256"/>
           </w:tcPr>
           <w:p>
             <w:r>
@@ -436,7 +436,7 @@
         </w:tc>
         <w:tc>
           <w:tcPr>
-            <w:tcW w:type="dxa" w:w="2160"/>
+            <w:tcW w:type="dxa" w:w="2256"/>
           </w:tcPr>
           <w:p>
             <w:r>
@@ -446,7 +446,7 @@
         </w:tc>
         <w:tc>
           <w:tcPr>
-            <w:tcW w:type="dxa" w:w="2160"/>
+            <w:tcW w:type="dxa" w:w="2256"/>
           </w:tcPr>
           <w:p>
             <w:r>
@@ -456,7 +456,7 @@
         </w:tc>
         <w:tc>
           <w:tcPr>
-            <w:tcW w:type="dxa" w:w="2160"/>
+            <w:tcW w:type="dxa" w:w="2256"/>
           </w:tcPr>
           <w:p>
             <w:r>
@@ -468,7 +468,7 @@
       <w:tr>
         <w:tc>
           <w:tcPr>
-            <w:tcW w:type="dxa" w:w="2160"/>
+            <w:tcW w:type="dxa" w:w="2256"/>
           </w:tcPr>
           <w:p>
             <w:r>
@@ -478,7 +478,7 @@
         </w:tc>
         <w:tc>
           <w:tcPr>
-            <w:tcW w:type="dxa" w:w="2160"/>
+            <w:tcW w:type="dxa" w:w="2256"/>
           </w:tcPr>
           <w:p>
             <w:r>
@@ -488,7 +488,7 @@
         </w:tc>
         <w:tc>
           <w:tcPr>
-            <w:tcW w:type="dxa" w:w="2160"/>
+            <w:tcW w:type="dxa" w:w="2256"/>
           </w:tcPr>
           <w:p>
             <w:r>
@@ -498,7 +498,7 @@
         </w:tc>
         <w:tc>
           <w:tcPr>
-            <w:tcW w:type="dxa" w:w="2160"/>
+            <w:tcW w:type="dxa" w:w="2256"/>
           </w:tcPr>
           <w:p>
             <w:r>
@@ -510,7 +510,7 @@
       <w:tr>
         <w:tc>
           <w:tcPr>
-            <w:tcW w:type="dxa" w:w="2160"/>
+            <w:tcW w:type="dxa" w:w="2256"/>
           </w:tcPr>
           <w:p>
             <w:r>
@@ -520,7 +520,7 @@
         </w:tc>
         <w:tc>
           <w:tcPr>
-            <w:tcW w:type="dxa" w:w="2160"/>
+            <w:tcW w:type="dxa" w:w="2256"/>
           </w:tcPr>
           <w:p>
             <w:r>
@@ -530,7 +530,7 @@
         </w:tc>
         <w:tc>
           <w:tcPr>
-            <w:tcW w:type="dxa" w:w="2160"/>
+            <w:tcW w:type="dxa" w:w="2256"/>
           </w:tcPr>
           <w:p>
             <w:r>
@@ -540,7 +540,7 @@
         </w:tc>
         <w:tc>
           <w:tcPr>
-            <w:tcW w:type="dxa" w:w="2160"/>
+            <w:tcW w:type="dxa" w:w="2256"/>
           </w:tcPr>
           <w:p>
             <w:r>
@@ -552,7 +552,7 @@
       <w:tr>
         <w:tc>
           <w:tcPr>
-            <w:tcW w:type="dxa" w:w="2160"/>
+            <w:tcW w:type="dxa" w:w="2256"/>
           </w:tcPr>
           <w:p>
             <w:r>
@@ -562,7 +562,7 @@
         </w:tc>
         <w:tc>
           <w:tcPr>
-            <w:tcW w:type="dxa" w:w="2160"/>
+            <w:tcW w:type="dxa" w:w="2256"/>
           </w:tcPr>
           <w:p>
             <w:r>
@@ -572,7 +572,7 @@
         </w:tc>
         <w:tc>
           <w:tcPr>
-            <w:tcW w:type="dxa" w:w="2160"/>
+            <w:tcW w:type="dxa" w:w="2256"/>
           </w:tcPr>
           <w:p>
             <w:r>
@@ -582,7 +582,7 @@
         </w:tc>
         <w:tc>
           <w:tcPr>
-            <w:tcW w:type="dxa" w:w="2160"/>
+            <w:tcW w:type="dxa" w:w="2256"/>
           </w:tcPr>
           <w:p>
             <w:r>
@@ -594,7 +594,7 @@
       <w:tr>
         <w:tc>
           <w:tcPr>
-            <w:tcW w:type="dxa" w:w="2160"/>
+            <w:tcW w:type="dxa" w:w="2256"/>
           </w:tcPr>
           <w:p>
             <w:r>
@@ -604,7 +604,7 @@
         </w:tc>
         <w:tc>
           <w:tcPr>
-            <w:tcW w:type="dxa" w:w="2160"/>
+            <w:tcW w:type="dxa" w:w="2256"/>
           </w:tcPr>
           <w:p>
             <w:r>
@@ -614,7 +614,7 @@
         </w:tc>
         <w:tc>
           <w:tcPr>
-            <w:tcW w:type="dxa" w:w="2160"/>
+            <w:tcW w:type="dxa" w:w="2256"/>
           </w:tcPr>
           <w:p>
             <w:r>
@@ -624,7 +624,7 @@
         </w:tc>
         <w:tc>
           <w:tcPr>
-            <w:tcW w:type="dxa" w:w="2160"/>
+            <w:tcW w:type="dxa" w:w="2256"/>
           </w:tcPr>
           <w:p>
             <w:r>
@@ -636,7 +636,7 @@
       <w:tr>
         <w:tc>
           <w:tcPr>
-            <w:tcW w:type="dxa" w:w="2160"/>
+            <w:tcW w:type="dxa" w:w="2256"/>
           </w:tcPr>
           <w:p>
             <w:r>
@@ -646,7 +646,7 @@
         </w:tc>
         <w:tc>
           <w:tcPr>
-            <w:tcW w:type="dxa" w:w="2160"/>
+            <w:tcW w:type="dxa" w:w="2256"/>
           </w:tcPr>
           <w:p>
             <w:r>
@@ -656,7 +656,7 @@
         </w:tc>
         <w:tc>
           <w:tcPr>
-            <w:tcW w:type="dxa" w:w="2160"/>
+            <w:tcW w:type="dxa" w:w="2256"/>
           </w:tcPr>
           <w:p>
             <w:r>
@@ -666,7 +666,7 @@
         </w:tc>
         <w:tc>
           <w:tcPr>
-            <w:tcW w:type="dxa" w:w="2160"/>
+            <w:tcW w:type="dxa" w:w="2256"/>
           </w:tcPr>
           <w:p>
             <w:r>
@@ -678,7 +678,7 @@
       <w:tr>
         <w:tc>
           <w:tcPr>
-            <w:tcW w:type="dxa" w:w="2160"/>
+            <w:tcW w:type="dxa" w:w="2256"/>
           </w:tcPr>
           <w:p>
             <w:r>
@@ -688,7 +688,7 @@
         </w:tc>
         <w:tc>
           <w:tcPr>
-            <w:tcW w:type="dxa" w:w="2160"/>
+            <w:tcW w:type="dxa" w:w="2256"/>
           </w:tcPr>
           <w:p>
             <w:r>
@@ -698,7 +698,7 @@
         </w:tc>
         <w:tc>
           <w:tcPr>
-            <w:tcW w:type="dxa" w:w="2160"/>
+            <w:tcW w:type="dxa" w:w="2256"/>
           </w:tcPr>
           <w:p>
             <w:r>
@@ -708,7 +708,7 @@
         </w:tc>
         <w:tc>
           <w:tcPr>
-            <w:tcW w:type="dxa" w:w="2160"/>
+            <w:tcW w:type="dxa" w:w="2256"/>
           </w:tcPr>
           <w:p>
             <w:r>
@@ -720,7 +720,7 @@
       <w:tr>
         <w:tc>
           <w:tcPr>
-            <w:tcW w:type="dxa" w:w="2160"/>
+            <w:tcW w:type="dxa" w:w="2256"/>
           </w:tcPr>
           <w:p>
             <w:r>
@@ -730,7 +730,7 @@
         </w:tc>
         <w:tc>
           <w:tcPr>
-            <w:tcW w:type="dxa" w:w="2160"/>
+            <w:tcW w:type="dxa" w:w="2256"/>
           </w:tcPr>
           <w:p>
             <w:r>
@@ -740,7 +740,7 @@
         </w:tc>
         <w:tc>
           <w:tcPr>
-            <w:tcW w:type="dxa" w:w="2160"/>
+            <w:tcW w:type="dxa" w:w="2256"/>
           </w:tcPr>
           <w:p>
             <w:r>
@@ -750,7 +750,7 @@
         </w:tc>
         <w:tc>
           <w:tcPr>
-            <w:tcW w:type="dxa" w:w="2160"/>
+            <w:tcW w:type="dxa" w:w="2256"/>
           </w:tcPr>
           <w:p>
             <w:r>
@@ -985,16 +985,16 @@
         <w:tblLook w:firstColumn="1" w:firstRow="1" w:lastColumn="0" w:lastRow="0" w:noHBand="0" w:noVBand="1" w:val="04A0"/>
       </w:tblPr>
       <w:tblGrid>
-        <w:gridCol w:w="1728"/>
-        <w:gridCol w:w="1728"/>
-        <w:gridCol w:w="1728"/>
-        <w:gridCol w:w="1728"/>
-        <w:gridCol w:w="1728"/>
+        <w:gridCol w:w="1805"/>
+        <w:gridCol w:w="1805"/>
+        <w:gridCol w:w="1805"/>
+        <w:gridCol w:w="1805"/>
+        <w:gridCol w:w="1805"/>
       </w:tblGrid>
       <w:tr>
         <w:tc>
           <w:tcPr>
-            <w:tcW w:type="dxa" w:w="1728"/>
+            <w:tcW w:type="dxa" w:w="1805"/>
           </w:tcPr>
           <w:p>
             <w:r>
@@ -1004,7 +1004,7 @@
         </w:tc>
         <w:tc>
           <w:tcPr>
-            <w:tcW w:type="dxa" w:w="1728"/>
+            <w:tcW w:type="dxa" w:w="1805"/>
           </w:tcPr>
           <w:p>
             <w:r>
@@ -1014,7 +1014,7 @@
         </w:tc>
         <w:tc>
           <w:tcPr>
-            <w:tcW w:type="dxa" w:w="1728"/>
+            <w:tcW w:type="dxa" w:w="1805"/>
           </w:tcPr>
           <w:p>
             <w:r>
@@ -1024,7 +1024,7 @@
         </w:tc>
         <w:tc>
           <w:tcPr>
-            <w:tcW w:type="dxa" w:w="1728"/>
+            <w:tcW w:type="dxa" w:w="1805"/>
           </w:tcPr>
           <w:p>
             <w:r>
@@ -1034,7 +1034,7 @@
         </w:tc>
         <w:tc>
           <w:tcPr>
-            <w:tcW w:type="dxa" w:w="1728"/>
+            <w:tcW w:type="dxa" w:w="1805"/>
           </w:tcPr>
           <w:p>
             <w:r>
@@ -1046,7 +1046,7 @@
       <w:tr>
         <w:tc>
           <w:tcPr>
-            <w:tcW w:type="dxa" w:w="1728"/>
+            <w:tcW w:type="dxa" w:w="1805"/>
           </w:tcPr>
           <w:p>
             <w:r>
@@ -1056,7 +1056,7 @@
         </w:tc>
         <w:tc>
           <w:tcPr>
-            <w:tcW w:type="dxa" w:w="1728"/>
+            <w:tcW w:type="dxa" w:w="1805"/>
           </w:tcPr>
           <w:p>
             <w:r>
@@ -1066,7 +1066,7 @@
         </w:tc>
         <w:tc>
           <w:tcPr>
-            <w:tcW w:type="dxa" w:w="1728"/>
+            <w:tcW w:type="dxa" w:w="1805"/>
           </w:tcPr>
           <w:p>
             <w:r>
@@ -1076,7 +1076,7 @@
         </w:tc>
         <w:tc>
           <w:tcPr>
-            <w:tcW w:type="dxa" w:w="1728"/>
+            <w:tcW w:type="dxa" w:w="1805"/>
           </w:tcPr>
           <w:p>
             <w:r>
@@ -1086,7 +1086,7 @@
         </w:tc>
         <w:tc>
           <w:tcPr>
-            <w:tcW w:type="dxa" w:w="1728"/>
+            <w:tcW w:type="dxa" w:w="1805"/>
           </w:tcPr>
           <w:p>
             <w:r>
@@ -1098,7 +1098,7 @@
       <w:tr>
         <w:tc>
           <w:tcPr>
-            <w:tcW w:type="dxa" w:w="1728"/>
+            <w:tcW w:type="dxa" w:w="1805"/>
           </w:tcPr>
           <w:p>
             <w:r>
@@ -1108,7 +1108,7 @@
         </w:tc>
         <w:tc>
           <w:tcPr>
-            <w:tcW w:type="dxa" w:w="1728"/>
+            <w:tcW w:type="dxa" w:w="1805"/>
           </w:tcPr>
           <w:p>
             <w:r>
@@ -1118,7 +1118,7 @@
         </w:tc>
         <w:tc>
           <w:tcPr>
-            <w:tcW w:type="dxa" w:w="1728"/>
+            <w:tcW w:type="dxa" w:w="1805"/>
           </w:tcPr>
           <w:p>
             <w:r>
@@ -1128,7 +1128,7 @@
         </w:tc>
         <w:tc>
           <w:tcPr>
-            <w:tcW w:type="dxa" w:w="1728"/>
+            <w:tcW w:type="dxa" w:w="1805"/>
           </w:tcPr>
           <w:p>
             <w:r>
@@ -1138,7 +1138,7 @@
         </w:tc>
         <w:tc>
           <w:tcPr>
-            <w:tcW w:type="dxa" w:w="1728"/>
+            <w:tcW w:type="dxa" w:w="1805"/>
           </w:tcPr>
           <w:p>
             <w:r>
@@ -1150,7 +1150,7 @@
       <w:tr>
         <w:tc>
           <w:tcPr>
-            <w:tcW w:type="dxa" w:w="1728"/>
+            <w:tcW w:type="dxa" w:w="1805"/>
           </w:tcPr>
           <w:p>
             <w:r>
@@ -1160,7 +1160,7 @@
         </w:tc>
         <w:tc>
           <w:tcPr>
-            <w:tcW w:type="dxa" w:w="1728"/>
+            <w:tcW w:type="dxa" w:w="1805"/>
           </w:tcPr>
           <w:p>
             <w:r>
@@ -1170,7 +1170,7 @@
         </w:tc>
         <w:tc>
           <w:tcPr>
-            <w:tcW w:type="dxa" w:w="1728"/>
+            <w:tcW w:type="dxa" w:w="1805"/>
           </w:tcPr>
           <w:p>
             <w:r>
@@ -1180,7 +1180,7 @@
         </w:tc>
         <w:tc>
           <w:tcPr>
-            <w:tcW w:type="dxa" w:w="1728"/>
+            <w:tcW w:type="dxa" w:w="1805"/>
           </w:tcPr>
           <w:p>
             <w:r>
@@ -1190,7 +1190,7 @@
         </w:tc>
         <w:tc>
           <w:tcPr>
-            <w:tcW w:type="dxa" w:w="1728"/>
+            <w:tcW w:type="dxa" w:w="1805"/>
           </w:tcPr>
           <w:p>
             <w:r>
@@ -1202,7 +1202,7 @@
       <w:tr>
         <w:tc>
           <w:tcPr>
-            <w:tcW w:type="dxa" w:w="1728"/>
+            <w:tcW w:type="dxa" w:w="1805"/>
           </w:tcPr>
           <w:p>
             <w:r>
@@ -1212,7 +1212,7 @@
         </w:tc>
         <w:tc>
           <w:tcPr>
-            <w:tcW w:type="dxa" w:w="1728"/>
+            <w:tcW w:type="dxa" w:w="1805"/>
           </w:tcPr>
           <w:p>
             <w:r>
@@ -1222,7 +1222,7 @@
         </w:tc>
         <w:tc>
           <w:tcPr>
-            <w:tcW w:type="dxa" w:w="1728"/>
+            <w:tcW w:type="dxa" w:w="1805"/>
           </w:tcPr>
           <w:p>
             <w:r>
@@ -1232,7 +1232,7 @@
         </w:tc>
         <w:tc>
           <w:tcPr>
-            <w:tcW w:type="dxa" w:w="1728"/>
+            <w:tcW w:type="dxa" w:w="1805"/>
           </w:tcPr>
           <w:p>
             <w:r>
@@ -1242,7 +1242,7 @@
         </w:tc>
         <w:tc>
           <w:tcPr>
-            <w:tcW w:type="dxa" w:w="1728"/>
+            <w:tcW w:type="dxa" w:w="1805"/>
           </w:tcPr>
           <w:p>
             <w:r>
@@ -1254,7 +1254,7 @@
       <w:tr>
         <w:tc>
           <w:tcPr>
-            <w:tcW w:type="dxa" w:w="1728"/>
+            <w:tcW w:type="dxa" w:w="1805"/>
           </w:tcPr>
           <w:p>
             <w:r>
@@ -1264,7 +1264,7 @@
         </w:tc>
         <w:tc>
           <w:tcPr>
-            <w:tcW w:type="dxa" w:w="1728"/>
+            <w:tcW w:type="dxa" w:w="1805"/>
           </w:tcPr>
           <w:p>
             <w:r>
@@ -1274,7 +1274,7 @@
         </w:tc>
         <w:tc>
           <w:tcPr>
-            <w:tcW w:type="dxa" w:w="1728"/>
+            <w:tcW w:type="dxa" w:w="1805"/>
           </w:tcPr>
           <w:p>
             <w:r>
@@ -1284,7 +1284,7 @@
         </w:tc>
         <w:tc>
           <w:tcPr>
-            <w:tcW w:type="dxa" w:w="1728"/>
+            <w:tcW w:type="dxa" w:w="1805"/>
           </w:tcPr>
           <w:p>
             <w:r>
@@ -1294,7 +1294,7 @@
         </w:tc>
         <w:tc>
           <w:tcPr>
-            <w:tcW w:type="dxa" w:w="1728"/>
+            <w:tcW w:type="dxa" w:w="1805"/>
           </w:tcPr>
           <w:p>
             <w:r>
@@ -1513,6 +1513,11 @@
       </w:r>
     </w:p>
     <w:p>
+      <w:r>
+        <w:br w:type="page"/>
+      </w:r>
+    </w:p>
+    <w:p>
       <w:pPr>
         <w:pStyle w:val="Heading2"/>
       </w:pPr>
@@ -1524,7 +1529,7 @@
       <w:r>
         <w:drawing>
           <wp:inline xmlns:a="http://schemas.openxmlformats.org/drawingml/2006/main" xmlns:pic="http://schemas.openxmlformats.org/drawingml/2006/picture">
-            <wp:extent cx="4800600" cy="16093068"/>
+            <wp:extent cx="2315797" cy="7763256"/>
             <wp:docPr id="2" name="Picture 2"/>
             <wp:cNvGraphicFramePr>
               <a:graphicFrameLocks noChangeAspect="1"/>
@@ -1545,7 +1550,7 @@
                   <pic:spPr>
                     <a:xfrm>
                       <a:off x="0" y="0"/>
-                      <a:ext cx="4800600" cy="16093068"/>
+                      <a:ext cx="2315797" cy="7763256"/>
                     </a:xfrm>
                     <a:prstGeom prst="rect"/>
                   </pic:spPr>
@@ -1689,8 +1694,8 @@
       </w:r>
     </w:p>
     <w:sectPr>
-      <w:pgSz w:w="12240" w:h="15840"/>
-      <w:pgMar w:top="1440" w:right="1800" w:bottom="1440" w:left="1800" w:header="720" w:footer="720" w:gutter="0"/>
+      <w:pgSz w:w="11906" w:h="16838"/>
+      <w:pgMar w:top="1440" w:right="1440" w:bottom="1440" w:left="1440" w:header="720" w:footer="720" w:gutter="0"/>
       <w:cols w:space="720"/>
       <w:docGrid w:linePitch="360"/>
     </w:sectPr>

</xml_diff>